<commit_message>
Admin guide v1.1: sync role table with catalog/estimator/scorecard access
The strange-tu merge landed rep access to My Scorecard, the Packaging
Estimator, and the Supplier Catalog (supplier cost visible to all
signed-in roles per the July 8 owner decision), making v1.0's 'reps
never see costs or supplier pricing' description wrong on arrival.
Sales Manager row updated to reflect the live Incentives manager view.

Co-Authored-By: Claude Fable 5 <noreply@anthropic.com>
</commit_message>
<xml_diff>
--- a/docs/Prometheus-User-Management-Admin-Guide.docx
+++ b/docs/Prometheus-User-Management-Admin-Guide.docx
@@ -54,7 +54,7 @@
           <w:sz w:val="20"/>
           <w:szCs w:val="20"/>
         </w:rPr>
-        <w:t>Version 1.0 · July 2026</w:t>
+        <w:t>Version 1.1 · July 2026</w:t>
       </w:r>
     </w:p>
     <w:p>
@@ -66,9 +66,8 @@
       <w:pPr>
         <w:pStyle w:val="Heading1"/>
       </w:pPr>
-      <w:bookmarkStart w:id="0" w:name="_Toc234498123"/>
-      <w:r>
-        <w:lastRenderedPageBreak/>
+      <w:bookmarkStart w:id="0" w:name="_Toc234500509"/>
+      <w:r>
         <w:t>Contents</w:t>
       </w:r>
       <w:bookmarkEnd w:id="0"/>
@@ -76,7 +75,7 @@
     <w:sdt>
       <w:sdtPr>
         <w:alias w:val="Table of Contents"/>
-        <w:id w:val="-1360816832"/>
+        <w:id w:val="-1953390006"/>
       </w:sdtPr>
       <w:sdtEndPr/>
       <w:sdtContent>
@@ -104,7 +103,7 @@
           <w:r>
             <w:fldChar w:fldCharType="separate"/>
           </w:r>
-          <w:hyperlink w:anchor="_Toc234498123" w:history="1">
+          <w:hyperlink w:anchor="_Toc234500509" w:history="1">
             <w:r>
               <w:rPr>
                 <w:rStyle w:val="Hyperlink"/>
@@ -128,7 +127,7 @@
               <w:rPr>
                 <w:noProof/>
               </w:rPr>
-              <w:instrText xml:space="preserve"> PAGEREF _Toc234498123 \h </w:instrText>
+              <w:instrText xml:space="preserve"> PAGEREF _Toc234500509 \h </w:instrText>
             </w:r>
             <w:r>
               <w:rPr>
@@ -170,7 +169,7 @@
               <w14:ligatures w14:val="standardContextual"/>
             </w:rPr>
           </w:pPr>
-          <w:hyperlink w:anchor="_Toc234498124" w:history="1">
+          <w:hyperlink w:anchor="_Toc234500510" w:history="1">
             <w:r>
               <w:rPr>
                 <w:rStyle w:val="Hyperlink"/>
@@ -194,7 +193,7 @@
               <w:rPr>
                 <w:noProof/>
               </w:rPr>
-              <w:instrText xml:space="preserve"> PAGEREF _Toc234498124 \h </w:instrText>
+              <w:instrText xml:space="preserve"> PAGEREF _Toc234500510 \h </w:instrText>
             </w:r>
             <w:r>
               <w:rPr>
@@ -236,7 +235,7 @@
               <w14:ligatures w14:val="standardContextual"/>
             </w:rPr>
           </w:pPr>
-          <w:hyperlink w:anchor="_Toc234498125" w:history="1">
+          <w:hyperlink w:anchor="_Toc234500511" w:history="1">
             <w:r>
               <w:rPr>
                 <w:rStyle w:val="Hyperlink"/>
@@ -260,7 +259,7 @@
               <w:rPr>
                 <w:noProof/>
               </w:rPr>
-              <w:instrText xml:space="preserve"> PAGEREF _Toc234498125 \h </w:instrText>
+              <w:instrText xml:space="preserve"> PAGEREF _Toc234500511 \h </w:instrText>
             </w:r>
             <w:r>
               <w:rPr>
@@ -302,7 +301,7 @@
               <w14:ligatures w14:val="standardContextual"/>
             </w:rPr>
           </w:pPr>
-          <w:hyperlink w:anchor="_Toc234498126" w:history="1">
+          <w:hyperlink w:anchor="_Toc234500512" w:history="1">
             <w:r>
               <w:rPr>
                 <w:rStyle w:val="Hyperlink"/>
@@ -326,7 +325,7 @@
               <w:rPr>
                 <w:noProof/>
               </w:rPr>
-              <w:instrText xml:space="preserve"> PAGEREF _Toc234498126 \h </w:instrText>
+              <w:instrText xml:space="preserve"> PAGEREF _Toc234500512 \h </w:instrText>
             </w:r>
             <w:r>
               <w:rPr>
@@ -368,7 +367,7 @@
               <w14:ligatures w14:val="standardContextual"/>
             </w:rPr>
           </w:pPr>
-          <w:hyperlink w:anchor="_Toc234498127" w:history="1">
+          <w:hyperlink w:anchor="_Toc234500513" w:history="1">
             <w:r>
               <w:rPr>
                 <w:rStyle w:val="Hyperlink"/>
@@ -392,7 +391,7 @@
               <w:rPr>
                 <w:noProof/>
               </w:rPr>
-              <w:instrText xml:space="preserve"> PAGEREF _Toc234498127 \h </w:instrText>
+              <w:instrText xml:space="preserve"> PAGEREF _Toc234500513 \h </w:instrText>
             </w:r>
             <w:r>
               <w:rPr>
@@ -434,7 +433,7 @@
               <w14:ligatures w14:val="standardContextual"/>
             </w:rPr>
           </w:pPr>
-          <w:hyperlink w:anchor="_Toc234498128" w:history="1">
+          <w:hyperlink w:anchor="_Toc234500514" w:history="1">
             <w:r>
               <w:rPr>
                 <w:rStyle w:val="Hyperlink"/>
@@ -458,7 +457,7 @@
               <w:rPr>
                 <w:noProof/>
               </w:rPr>
-              <w:instrText xml:space="preserve"> PAGEREF _Toc234498128 \h </w:instrText>
+              <w:instrText xml:space="preserve"> PAGEREF _Toc234500514 \h </w:instrText>
             </w:r>
             <w:r>
               <w:rPr>
@@ -500,7 +499,7 @@
               <w14:ligatures w14:val="standardContextual"/>
             </w:rPr>
           </w:pPr>
-          <w:hyperlink w:anchor="_Toc234498129" w:history="1">
+          <w:hyperlink w:anchor="_Toc234500515" w:history="1">
             <w:r>
               <w:rPr>
                 <w:rStyle w:val="Hyperlink"/>
@@ -524,7 +523,7 @@
               <w:rPr>
                 <w:noProof/>
               </w:rPr>
-              <w:instrText xml:space="preserve"> PAGEREF _Toc234498129 \h </w:instrText>
+              <w:instrText xml:space="preserve"> PAGEREF _Toc234500515 \h </w:instrText>
             </w:r>
             <w:r>
               <w:rPr>
@@ -566,7 +565,7 @@
               <w14:ligatures w14:val="standardContextual"/>
             </w:rPr>
           </w:pPr>
-          <w:hyperlink w:anchor="_Toc234498130" w:history="1">
+          <w:hyperlink w:anchor="_Toc234500516" w:history="1">
             <w:r>
               <w:rPr>
                 <w:rStyle w:val="Hyperlink"/>
@@ -590,7 +589,7 @@
               <w:rPr>
                 <w:noProof/>
               </w:rPr>
-              <w:instrText xml:space="preserve"> PAGEREF _Toc234498130 \h </w:instrText>
+              <w:instrText xml:space="preserve"> PAGEREF _Toc234500516 \h </w:instrText>
             </w:r>
             <w:r>
               <w:rPr>
@@ -632,7 +631,7 @@
               <w14:ligatures w14:val="standardContextual"/>
             </w:rPr>
           </w:pPr>
-          <w:hyperlink w:anchor="_Toc234498131" w:history="1">
+          <w:hyperlink w:anchor="_Toc234500517" w:history="1">
             <w:r>
               <w:rPr>
                 <w:rStyle w:val="Hyperlink"/>
@@ -656,7 +655,7 @@
               <w:rPr>
                 <w:noProof/>
               </w:rPr>
-              <w:instrText xml:space="preserve"> PAGEREF _Toc234498131 \h </w:instrText>
+              <w:instrText xml:space="preserve"> PAGEREF _Toc234500517 \h </w:instrText>
             </w:r>
             <w:r>
               <w:rPr>
@@ -698,7 +697,7 @@
               <w14:ligatures w14:val="standardContextual"/>
             </w:rPr>
           </w:pPr>
-          <w:hyperlink w:anchor="_Toc234498132" w:history="1">
+          <w:hyperlink w:anchor="_Toc234500518" w:history="1">
             <w:r>
               <w:rPr>
                 <w:rStyle w:val="Hyperlink"/>
@@ -722,7 +721,7 @@
               <w:rPr>
                 <w:noProof/>
               </w:rPr>
-              <w:instrText xml:space="preserve"> PAGEREF _Toc234498132 \h </w:instrText>
+              <w:instrText xml:space="preserve"> PAGEREF _Toc234500518 \h </w:instrText>
             </w:r>
             <w:r>
               <w:rPr>
@@ -764,7 +763,7 @@
               <w14:ligatures w14:val="standardContextual"/>
             </w:rPr>
           </w:pPr>
-          <w:hyperlink w:anchor="_Toc234498133" w:history="1">
+          <w:hyperlink w:anchor="_Toc234500519" w:history="1">
             <w:r>
               <w:rPr>
                 <w:rStyle w:val="Hyperlink"/>
@@ -788,7 +787,7 @@
               <w:rPr>
                 <w:noProof/>
               </w:rPr>
-              <w:instrText xml:space="preserve"> PAGEREF _Toc234498133 \h </w:instrText>
+              <w:instrText xml:space="preserve"> PAGEREF _Toc234500519 \h </w:instrText>
             </w:r>
             <w:r>
               <w:rPr>
@@ -830,7 +829,7 @@
               <w14:ligatures w14:val="standardContextual"/>
             </w:rPr>
           </w:pPr>
-          <w:hyperlink w:anchor="_Toc234498134" w:history="1">
+          <w:hyperlink w:anchor="_Toc234500520" w:history="1">
             <w:r>
               <w:rPr>
                 <w:rStyle w:val="Hyperlink"/>
@@ -854,7 +853,7 @@
               <w:rPr>
                 <w:noProof/>
               </w:rPr>
-              <w:instrText xml:space="preserve"> PAGEREF _Toc234498134 \h </w:instrText>
+              <w:instrText xml:space="preserve"> PAGEREF _Toc234500520 \h </w:instrText>
             </w:r>
             <w:r>
               <w:rPr>
@@ -896,7 +895,7 @@
               <w14:ligatures w14:val="standardContextual"/>
             </w:rPr>
           </w:pPr>
-          <w:hyperlink w:anchor="_Toc234498135" w:history="1">
+          <w:hyperlink w:anchor="_Toc234500521" w:history="1">
             <w:r>
               <w:rPr>
                 <w:rStyle w:val="Hyperlink"/>
@@ -920,7 +919,7 @@
               <w:rPr>
                 <w:noProof/>
               </w:rPr>
-              <w:instrText xml:space="preserve"> PAGEREF _Toc234498135 \h </w:instrText>
+              <w:instrText xml:space="preserve"> PAGEREF _Toc234500521 \h </w:instrText>
             </w:r>
             <w:r>
               <w:rPr>
@@ -963,9 +962,8 @@
       <w:pPr>
         <w:pStyle w:val="Heading1"/>
       </w:pPr>
-      <w:bookmarkStart w:id="1" w:name="_Toc234498124"/>
-      <w:r>
-        <w:lastRenderedPageBreak/>
+      <w:bookmarkStart w:id="1" w:name="_Toc234500510"/>
+      <w:r>
         <w:t>1. Introduction</w:t>
       </w:r>
       <w:bookmarkEnd w:id="1"/>
@@ -1010,7 +1008,7 @@
       <w:pPr>
         <w:pStyle w:val="Heading1"/>
       </w:pPr>
-      <w:bookmarkStart w:id="2" w:name="_Toc234498125"/>
+      <w:bookmarkStart w:id="2" w:name="_Toc234500511"/>
       <w:r>
         <w:t>2. The Five Roles at a Glance</w:t>
       </w:r>
@@ -1465,7 +1463,7 @@
                 <w:sz w:val="20"/>
                 <w:szCs w:val="20"/>
               </w:rPr>
-              <w:t>The sales experience only: the Sales dashboard (with performance scorecards for the whole team), plus their own quotes and orders — they cannot open another rep’s orders or customers, and never see costs, supplier pricing, or admin screens.</w:t>
+              <w:t>The sales experience: the Sales dashboard (with performance scorecards for the whole team), My Scorecard (their own incentive numbers), the Packaging Estimator, the Supplier Catalog (including supplier cost — an owner decision of July 2026), and their own quotes and orders. They cannot open another rep’s orders or customers, and never see admin or operations screens.</w:t>
             </w:r>
           </w:p>
         </w:tc>
@@ -1552,15 +1550,7 @@
                 <w:sz w:val="20"/>
                 <w:szCs w:val="20"/>
               </w:rPr>
-              <w:t xml:space="preserve">Reserved for the upcoming compensation feature: everything a Sales Rep has, plus visibility into all reps’ orders and (when it </w:t>
-            </w:r>
-            <w:r>
-              <w:rPr>
-                <w:sz w:val="20"/>
-                <w:szCs w:val="20"/>
-              </w:rPr>
-              <w:lastRenderedPageBreak/>
-              <w:t>ships) all reps’ compensation. Avoid assigning it until that feature launches.</w:t>
+              <w:t>Everything a Sales Rep has, plus the full Incentives dashboard across all reps. Compensation visibility across the team lands here as the comp feature rolls out.</w:t>
             </w:r>
           </w:p>
         </w:tc>
@@ -1586,8 +1576,7 @@
                 <w:sz w:val="20"/>
                 <w:szCs w:val="20"/>
               </w:rPr>
-              <w:lastRenderedPageBreak/>
-              <w:t>Future sales leadership</w:t>
+              <w:t>Sales leadership</w:t>
             </w:r>
           </w:p>
         </w:tc>
@@ -1615,14 +1604,14 @@
         <w:t xml:space="preserve">Rule of thumb: </w:t>
       </w:r>
       <w:r>
-        <w:t>Sales Reps see their own numbers in detail and everyone’s scorecard totals. Staff see the whole business but no owner controls. Admins see everything except system credentials. The Superadmin holds the keys.</w:t>
+        <w:t>Sales Reps see their own numbers in detail, everyone’s scorecard totals, and the supplier catalog. Staff see the whole business but no owner controls. Admins see everything except system credentials. The Superadmin holds the keys.</w:t>
       </w:r>
     </w:p>
     <w:p>
       <w:pPr>
         <w:pStyle w:val="Heading1"/>
       </w:pPr>
-      <w:bookmarkStart w:id="3" w:name="_Toc234498126"/>
+      <w:bookmarkStart w:id="3" w:name="_Toc234500512"/>
       <w:r>
         <w:t>3. How Signing In Works</w:t>
       </w:r>
@@ -1705,7 +1694,7 @@
       <w:pPr>
         <w:pStyle w:val="Heading1"/>
       </w:pPr>
-      <w:bookmarkStart w:id="4" w:name="_Toc234498127"/>
+      <w:bookmarkStart w:id="4" w:name="_Toc234500513"/>
       <w:r>
         <w:t>4. The Users Page</w:t>
       </w:r>
@@ -1849,7 +1838,7 @@
       <w:pPr>
         <w:pStyle w:val="Heading1"/>
       </w:pPr>
-      <w:bookmarkStart w:id="5" w:name="_Toc234498128"/>
+      <w:bookmarkStart w:id="5" w:name="_Toc234500514"/>
       <w:r>
         <w:t>5. Inviting a New User</w:t>
       </w:r>
@@ -1944,11 +1933,7 @@
         <w:t>Sales Rep</w:t>
       </w:r>
       <w:r>
-        <w:t xml:space="preserve">: a “Fishbowl user ID” field appears. Fill it in if you know it — this is what links the rep to their own orders and quotes. You can leave it blank and add it </w:t>
-      </w:r>
-      <w:r>
-        <w:lastRenderedPageBreak/>
-        <w:t>later, but until the rep is linked they will see an empty orders list (by design, never someone else’s data).</w:t>
+        <w:t>: a “Fishbowl user ID” field appears. Fill it in if you know it — this is what links the rep to their own orders and quotes. You can leave it blank and add it later, but until the rep is linked they will see an empty orders list (by design, never someone else’s data).</w:t>
       </w:r>
     </w:p>
     <w:p>
@@ -2006,7 +1991,7 @@
       <w:pPr>
         <w:pStyle w:val="Heading1"/>
       </w:pPr>
-      <w:bookmarkStart w:id="6" w:name="_Toc234498129"/>
+      <w:bookmarkStart w:id="6" w:name="_Toc234500515"/>
       <w:r>
         <w:t>6. Changing a User’s Role</w:t>
       </w:r>
@@ -2063,7 +2048,7 @@
       <w:pPr>
         <w:pStyle w:val="Heading1"/>
       </w:pPr>
-      <w:bookmarkStart w:id="7" w:name="_Toc234498130"/>
+      <w:bookmarkStart w:id="7" w:name="_Toc234500516"/>
       <w:r>
         <w:t>7. Deactivating and Reactivating</w:t>
       </w:r>
@@ -2125,7 +2110,7 @@
       <w:pPr>
         <w:pStyle w:val="Heading1"/>
       </w:pPr>
-      <w:bookmarkStart w:id="8" w:name="_Toc234498131"/>
+      <w:bookmarkStart w:id="8" w:name="_Toc234500517"/>
       <w:r>
         <w:t>8. Two-Factor Authentication (Email Codes)</w:t>
       </w:r>
@@ -2143,7 +2128,7 @@
       <w:pPr>
         <w:pStyle w:val="Heading2"/>
       </w:pPr>
-      <w:bookmarkStart w:id="9" w:name="_Toc234498132"/>
+      <w:bookmarkStart w:id="9" w:name="_Toc234500518"/>
       <w:r>
         <w:t>The rules the codes follow</w:t>
       </w:r>
@@ -2225,7 +2210,7 @@
       <w:pPr>
         <w:pStyle w:val="Heading2"/>
       </w:pPr>
-      <w:bookmarkStart w:id="10" w:name="_Toc234498133"/>
+      <w:bookmarkStart w:id="10" w:name="_Toc234500519"/>
       <w:r>
         <w:t>Turning it on or off</w:t>
       </w:r>
@@ -2236,18 +2221,14 @@
         <w:spacing w:after="160"/>
       </w:pPr>
       <w:r>
-        <w:t xml:space="preserve">The switch is a hosting setting (the TWO_FACTOR_ENABLED variable in Railway), not a button in the app, and it is owned by the Superadmin. It ships switched off so that email delivery can be proven first; the safe order is: confirm an invite email arrives, then switch it on. If email </w:t>
-      </w:r>
-      <w:r>
-        <w:lastRenderedPageBreak/>
-        <w:t>delivery ever breaks while 2FA is on, nobody can complete a login — the fix is to switch it off in Railway, resolve email, and switch it back on.</w:t>
+        <w:t>The switch is a hosting setting (the TWO_FACTOR_ENABLED variable in Railway), not a button in the app, and it is owned by the Superadmin. It ships switched off so that email delivery can be proven first; the safe order is: confirm an invite email arrives, then switch it on. If email delivery ever breaks while 2FA is on, nobody can complete a login — the fix is to switch it off in Railway, resolve email, and switch it back on.</w:t>
       </w:r>
     </w:p>
     <w:p>
       <w:pPr>
         <w:pStyle w:val="Heading1"/>
       </w:pPr>
-      <w:bookmarkStart w:id="11" w:name="_Toc234498134"/>
+      <w:bookmarkStart w:id="11" w:name="_Toc234500520"/>
       <w:r>
         <w:t>9. Troubleshooting</w:t>
       </w:r>
@@ -2776,7 +2757,7 @@
       <w:pPr>
         <w:pStyle w:val="Heading1"/>
       </w:pPr>
-      <w:bookmarkStart w:id="12" w:name="_Toc234498135"/>
+      <w:bookmarkStart w:id="12" w:name="_Toc234500521"/>
       <w:r>
         <w:t>10. Quick Reference</w:t>
       </w:r>
@@ -3269,7 +3250,6 @@
                 <w:sz w:val="20"/>
                 <w:szCs w:val="20"/>
               </w:rPr>
-              <w:lastRenderedPageBreak/>
               <w:t>Turn 2FA on/off</w:t>
             </w:r>
           </w:p>
@@ -3531,10 +3511,280 @@
 <file path=word/numbering.xml><?xml version="1.0" encoding="utf-8"?>
 <w:numbering xmlns:wpc="http://schemas.microsoft.com/office/word/2010/wordprocessingCanvas" xmlns:cx="http://schemas.microsoft.com/office/drawing/2014/chartex" xmlns:cx1="http://schemas.microsoft.com/office/drawing/2015/9/8/chartex" xmlns:cx2="http://schemas.microsoft.com/office/drawing/2015/10/21/chartex" xmlns:cx3="http://schemas.microsoft.com/office/drawing/2016/5/9/chartex" xmlns:cx4="http://schemas.microsoft.com/office/drawing/2016/5/10/chartex" xmlns:cx5="http://schemas.microsoft.com/office/drawing/2016/5/11/chartex" xmlns:cx6="http://schemas.microsoft.com/office/drawing/2016/5/12/chartex" xmlns:cx7="http://schemas.microsoft.com/office/drawing/2016/5/13/chartex" xmlns:cx8="http://schemas.microsoft.com/office/drawing/2016/5/14/chartex" xmlns:mc="http://schemas.openxmlformats.org/markup-compatibility/2006" xmlns:aink="http://schemas.microsoft.com/office/drawing/2016/ink" xmlns:am3d="http://schemas.microsoft.com/office/drawing/2017/model3d" xmlns:o="urn:schemas-microsoft-com:office:office" xmlns:oel="http://schemas.microsoft.com/office/2019/extlst" xmlns:r="http://schemas.openxmlformats.org/officeDocument/2006/relationships" xmlns:m="http://schemas.openxmlformats.org/officeDocument/2006/math" xmlns:v="urn:schemas-microsoft-com:vml" xmlns:wp14="http://schemas.microsoft.com/office/word/2010/wordprocessingDrawing" xmlns:wp="http://schemas.openxmlformats.org/drawingml/2006/wordprocessingDrawing" xmlns:w10="urn:schemas-microsoft-com:office:word" xmlns:w="http://schemas.openxmlformats.org/wordprocessingml/2006/main" xmlns:w14="http://schemas.microsoft.com/office/word/2010/wordml" xmlns:w15="http://schemas.microsoft.com/office/word/2012/wordml" xmlns:w16cex="http://schemas.microsoft.com/office/word/2018/wordml/cex" xmlns:w16cid="http://schemas.microsoft.com/office/word/2016/wordml/cid" xmlns:w16="http://schemas.microsoft.com/office/word/2018/wordml" xmlns:w16du="http://schemas.microsoft.com/office/word/2023/wordml/word16du" xmlns:w16sdtdh="http://schemas.microsoft.com/office/word/2020/wordml/sdtdatahash" xmlns:w16sdtfl="http://schemas.microsoft.com/office/word/2024/wordml/sdtformatlock" xmlns:w16se="http://schemas.microsoft.com/office/word/2015/wordml/symex" xmlns:wpg="http://schemas.microsoft.com/office/word/2010/wordprocessingGroup" xmlns:wpi="http://schemas.microsoft.com/office/word/2010/wordprocessingInk" xmlns:wne="http://schemas.microsoft.com/office/word/2006/wordml" xmlns:wps="http://schemas.microsoft.com/office/word/2010/wordprocessingShape" mc:Ignorable="w14 w15 w16se w16cid w16 w16cex w16sdtdh w16sdtfl w16du wp14">
   <w:abstractNum w:abstractNumId="0" w15:restartNumberingAfterBreak="0">
-    <w:nsid w:val="1B6117AC"/>
+    <w:nsid w:val="169916DE"/>
     <w:multiLevelType w:val="hybridMultilevel"/>
-    <w:tmpl w:val="06BEE7C8"/>
-    <w:lvl w:ilvl="0" w:tplc="7D6E7A0A">
+    <w:tmpl w:val="E0E2D6A0"/>
+    <w:lvl w:ilvl="0" w:tplc="5D54BDE0">
+      <w:start w:val="1"/>
+      <w:numFmt w:val="bullet"/>
+      <w:lvlText w:val="•"/>
+      <w:lvlJc w:val="left"/>
+      <w:pPr>
+        <w:ind w:left="720" w:hanging="360"/>
+      </w:pPr>
+    </w:lvl>
+    <w:lvl w:ilvl="1" w:tplc="D65AF85C">
+      <w:numFmt w:val="decimal"/>
+      <w:lvlText w:val=""/>
+      <w:lvlJc w:val="left"/>
+    </w:lvl>
+    <w:lvl w:ilvl="2" w:tplc="9AA67714">
+      <w:numFmt w:val="decimal"/>
+      <w:lvlText w:val=""/>
+      <w:lvlJc w:val="left"/>
+    </w:lvl>
+    <w:lvl w:ilvl="3" w:tplc="AB4ABF6C">
+      <w:numFmt w:val="decimal"/>
+      <w:lvlText w:val=""/>
+      <w:lvlJc w:val="left"/>
+    </w:lvl>
+    <w:lvl w:ilvl="4" w:tplc="20E0B382">
+      <w:numFmt w:val="decimal"/>
+      <w:lvlText w:val=""/>
+      <w:lvlJc w:val="left"/>
+    </w:lvl>
+    <w:lvl w:ilvl="5" w:tplc="F76C97C8">
+      <w:numFmt w:val="decimal"/>
+      <w:lvlText w:val=""/>
+      <w:lvlJc w:val="left"/>
+    </w:lvl>
+    <w:lvl w:ilvl="6" w:tplc="62F27CAE">
+      <w:numFmt w:val="decimal"/>
+      <w:lvlText w:val=""/>
+      <w:lvlJc w:val="left"/>
+    </w:lvl>
+    <w:lvl w:ilvl="7" w:tplc="B8B8E190">
+      <w:numFmt w:val="decimal"/>
+      <w:lvlText w:val=""/>
+      <w:lvlJc w:val="left"/>
+    </w:lvl>
+    <w:lvl w:ilvl="8" w:tplc="EE942380">
+      <w:numFmt w:val="decimal"/>
+      <w:lvlText w:val=""/>
+      <w:lvlJc w:val="left"/>
+    </w:lvl>
+  </w:abstractNum>
+  <w:abstractNum w:abstractNumId="1" w15:restartNumberingAfterBreak="0">
+    <w:nsid w:val="2B6B59CA"/>
+    <w:multiLevelType w:val="hybridMultilevel"/>
+    <w:tmpl w:val="C86A494E"/>
+    <w:lvl w:ilvl="0" w:tplc="85E413F2">
+      <w:start w:val="1"/>
+      <w:numFmt w:val="decimal"/>
+      <w:lvlText w:val="%1."/>
+      <w:lvlJc w:val="left"/>
+      <w:pPr>
+        <w:ind w:left="720" w:hanging="360"/>
+      </w:pPr>
+    </w:lvl>
+    <w:lvl w:ilvl="1" w:tplc="9F5E3F0A">
+      <w:numFmt w:val="decimal"/>
+      <w:lvlText w:val=""/>
+      <w:lvlJc w:val="left"/>
+    </w:lvl>
+    <w:lvl w:ilvl="2" w:tplc="D1D2E19A">
+      <w:numFmt w:val="decimal"/>
+      <w:lvlText w:val=""/>
+      <w:lvlJc w:val="left"/>
+    </w:lvl>
+    <w:lvl w:ilvl="3" w:tplc="6B96E288">
+      <w:numFmt w:val="decimal"/>
+      <w:lvlText w:val=""/>
+      <w:lvlJc w:val="left"/>
+    </w:lvl>
+    <w:lvl w:ilvl="4" w:tplc="3AB45D22">
+      <w:numFmt w:val="decimal"/>
+      <w:lvlText w:val=""/>
+      <w:lvlJc w:val="left"/>
+    </w:lvl>
+    <w:lvl w:ilvl="5" w:tplc="37203C50">
+      <w:numFmt w:val="decimal"/>
+      <w:lvlText w:val=""/>
+      <w:lvlJc w:val="left"/>
+    </w:lvl>
+    <w:lvl w:ilvl="6" w:tplc="5544985A">
+      <w:numFmt w:val="decimal"/>
+      <w:lvlText w:val=""/>
+      <w:lvlJc w:val="left"/>
+    </w:lvl>
+    <w:lvl w:ilvl="7" w:tplc="5C7207A6">
+      <w:numFmt w:val="decimal"/>
+      <w:lvlText w:val=""/>
+      <w:lvlJc w:val="left"/>
+    </w:lvl>
+    <w:lvl w:ilvl="8" w:tplc="BEA8C2F4">
+      <w:numFmt w:val="decimal"/>
+      <w:lvlText w:val=""/>
+      <w:lvlJc w:val="left"/>
+    </w:lvl>
+  </w:abstractNum>
+  <w:abstractNum w:abstractNumId="2" w15:restartNumberingAfterBreak="0">
+    <w:nsid w:val="2F464D0E"/>
+    <w:multiLevelType w:val="hybridMultilevel"/>
+    <w:tmpl w:val="C2584704"/>
+    <w:lvl w:ilvl="0" w:tplc="E28A6236">
+      <w:start w:val="1"/>
+      <w:numFmt w:val="decimal"/>
+      <w:lvlText w:val="%1."/>
+      <w:lvlJc w:val="left"/>
+      <w:pPr>
+        <w:ind w:left="720" w:hanging="360"/>
+      </w:pPr>
+    </w:lvl>
+    <w:lvl w:ilvl="1" w:tplc="07C8F968">
+      <w:numFmt w:val="decimal"/>
+      <w:lvlText w:val=""/>
+      <w:lvlJc w:val="left"/>
+    </w:lvl>
+    <w:lvl w:ilvl="2" w:tplc="C30089E8">
+      <w:numFmt w:val="decimal"/>
+      <w:lvlText w:val=""/>
+      <w:lvlJc w:val="left"/>
+    </w:lvl>
+    <w:lvl w:ilvl="3" w:tplc="140C5482">
+      <w:numFmt w:val="decimal"/>
+      <w:lvlText w:val=""/>
+      <w:lvlJc w:val="left"/>
+    </w:lvl>
+    <w:lvl w:ilvl="4" w:tplc="605410CE">
+      <w:numFmt w:val="decimal"/>
+      <w:lvlText w:val=""/>
+      <w:lvlJc w:val="left"/>
+    </w:lvl>
+    <w:lvl w:ilvl="5" w:tplc="ED0EB626">
+      <w:numFmt w:val="decimal"/>
+      <w:lvlText w:val=""/>
+      <w:lvlJc w:val="left"/>
+    </w:lvl>
+    <w:lvl w:ilvl="6" w:tplc="4CDC0824">
+      <w:numFmt w:val="decimal"/>
+      <w:lvlText w:val=""/>
+      <w:lvlJc w:val="left"/>
+    </w:lvl>
+    <w:lvl w:ilvl="7" w:tplc="BADE8736">
+      <w:numFmt w:val="decimal"/>
+      <w:lvlText w:val=""/>
+      <w:lvlJc w:val="left"/>
+    </w:lvl>
+    <w:lvl w:ilvl="8" w:tplc="8F727A5C">
+      <w:numFmt w:val="decimal"/>
+      <w:lvlText w:val=""/>
+      <w:lvlJc w:val="left"/>
+    </w:lvl>
+  </w:abstractNum>
+  <w:abstractNum w:abstractNumId="3" w15:restartNumberingAfterBreak="0">
+    <w:nsid w:val="448F76BC"/>
+    <w:multiLevelType w:val="hybridMultilevel"/>
+    <w:tmpl w:val="D570B876"/>
+    <w:lvl w:ilvl="0" w:tplc="3CE48816">
+      <w:start w:val="1"/>
+      <w:numFmt w:val="decimal"/>
+      <w:lvlText w:val="%1."/>
+      <w:lvlJc w:val="left"/>
+      <w:pPr>
+        <w:ind w:left="720" w:hanging="360"/>
+      </w:pPr>
+    </w:lvl>
+    <w:lvl w:ilvl="1" w:tplc="493610D8">
+      <w:numFmt w:val="decimal"/>
+      <w:lvlText w:val=""/>
+      <w:lvlJc w:val="left"/>
+    </w:lvl>
+    <w:lvl w:ilvl="2" w:tplc="6C080B0E">
+      <w:numFmt w:val="decimal"/>
+      <w:lvlText w:val=""/>
+      <w:lvlJc w:val="left"/>
+    </w:lvl>
+    <w:lvl w:ilvl="3" w:tplc="7D7EE844">
+      <w:numFmt w:val="decimal"/>
+      <w:lvlText w:val=""/>
+      <w:lvlJc w:val="left"/>
+    </w:lvl>
+    <w:lvl w:ilvl="4" w:tplc="35DA35B2">
+      <w:numFmt w:val="decimal"/>
+      <w:lvlText w:val=""/>
+      <w:lvlJc w:val="left"/>
+    </w:lvl>
+    <w:lvl w:ilvl="5" w:tplc="5D12E598">
+      <w:numFmt w:val="decimal"/>
+      <w:lvlText w:val=""/>
+      <w:lvlJc w:val="left"/>
+    </w:lvl>
+    <w:lvl w:ilvl="6" w:tplc="BF92D83A">
+      <w:numFmt w:val="decimal"/>
+      <w:lvlText w:val=""/>
+      <w:lvlJc w:val="left"/>
+    </w:lvl>
+    <w:lvl w:ilvl="7" w:tplc="B8A63666">
+      <w:numFmt w:val="decimal"/>
+      <w:lvlText w:val=""/>
+      <w:lvlJc w:val="left"/>
+    </w:lvl>
+    <w:lvl w:ilvl="8" w:tplc="33C0D3FE">
+      <w:numFmt w:val="decimal"/>
+      <w:lvlText w:val=""/>
+      <w:lvlJc w:val="left"/>
+    </w:lvl>
+  </w:abstractNum>
+  <w:abstractNum w:abstractNumId="4" w15:restartNumberingAfterBreak="0">
+    <w:nsid w:val="47827DC7"/>
+    <w:multiLevelType w:val="hybridMultilevel"/>
+    <w:tmpl w:val="425E93A4"/>
+    <w:lvl w:ilvl="0" w:tplc="92B6CEF0">
+      <w:start w:val="1"/>
+      <w:numFmt w:val="decimal"/>
+      <w:lvlText w:val="%1."/>
+      <w:lvlJc w:val="left"/>
+      <w:pPr>
+        <w:ind w:left="720" w:hanging="360"/>
+      </w:pPr>
+    </w:lvl>
+    <w:lvl w:ilvl="1" w:tplc="54D042D6">
+      <w:numFmt w:val="decimal"/>
+      <w:lvlText w:val=""/>
+      <w:lvlJc w:val="left"/>
+    </w:lvl>
+    <w:lvl w:ilvl="2" w:tplc="5F0EF76E">
+      <w:numFmt w:val="decimal"/>
+      <w:lvlText w:val=""/>
+      <w:lvlJc w:val="left"/>
+    </w:lvl>
+    <w:lvl w:ilvl="3" w:tplc="EBE8C7D4">
+      <w:numFmt w:val="decimal"/>
+      <w:lvlText w:val=""/>
+      <w:lvlJc w:val="left"/>
+    </w:lvl>
+    <w:lvl w:ilvl="4" w:tplc="925C7CC4">
+      <w:numFmt w:val="decimal"/>
+      <w:lvlText w:val=""/>
+      <w:lvlJc w:val="left"/>
+    </w:lvl>
+    <w:lvl w:ilvl="5" w:tplc="CA1E968E">
+      <w:numFmt w:val="decimal"/>
+      <w:lvlText w:val=""/>
+      <w:lvlJc w:val="left"/>
+    </w:lvl>
+    <w:lvl w:ilvl="6" w:tplc="669E2B90">
+      <w:numFmt w:val="decimal"/>
+      <w:lvlText w:val=""/>
+      <w:lvlJc w:val="left"/>
+    </w:lvl>
+    <w:lvl w:ilvl="7" w:tplc="981C1A44">
+      <w:numFmt w:val="decimal"/>
+      <w:lvlText w:val=""/>
+      <w:lvlJc w:val="left"/>
+    </w:lvl>
+    <w:lvl w:ilvl="8" w:tplc="F33CC5CC">
+      <w:numFmt w:val="decimal"/>
+      <w:lvlText w:val=""/>
+      <w:lvlJc w:val="left"/>
+    </w:lvl>
+  </w:abstractNum>
+  <w:abstractNum w:abstractNumId="5" w15:restartNumberingAfterBreak="0">
+    <w:nsid w:val="4DBF60F0"/>
+    <w:multiLevelType w:val="hybridMultilevel"/>
+    <w:tmpl w:val="EDBCE258"/>
+    <w:lvl w:ilvl="0" w:tplc="CF9AD404">
       <w:start w:val="1"/>
       <w:numFmt w:val="bullet"/>
       <w:lvlText w:val="●"/>
@@ -3543,7 +3793,7 @@
         <w:ind w:left="720" w:hanging="360"/>
       </w:pPr>
     </w:lvl>
-    <w:lvl w:ilvl="1" w:tplc="2C6EDD08">
+    <w:lvl w:ilvl="1" w:tplc="3552DE52">
       <w:start w:val="1"/>
       <w:numFmt w:val="bullet"/>
       <w:lvlText w:val="○"/>
@@ -3552,7 +3802,7 @@
         <w:ind w:left="1440" w:hanging="360"/>
       </w:pPr>
     </w:lvl>
-    <w:lvl w:ilvl="2" w:tplc="F970FF90">
+    <w:lvl w:ilvl="2" w:tplc="8382A30A">
       <w:start w:val="1"/>
       <w:numFmt w:val="bullet"/>
       <w:lvlText w:val="■"/>
@@ -3561,7 +3811,7 @@
         <w:ind w:left="2160" w:hanging="360"/>
       </w:pPr>
     </w:lvl>
-    <w:lvl w:ilvl="3" w:tplc="F8F213D2">
+    <w:lvl w:ilvl="3" w:tplc="40CEB03A">
       <w:start w:val="1"/>
       <w:numFmt w:val="bullet"/>
       <w:lvlText w:val="●"/>
@@ -3570,7 +3820,7 @@
         <w:ind w:left="2880" w:hanging="360"/>
       </w:pPr>
     </w:lvl>
-    <w:lvl w:ilvl="4" w:tplc="DBB6876C">
+    <w:lvl w:ilvl="4" w:tplc="109A589E">
       <w:start w:val="1"/>
       <w:numFmt w:val="bullet"/>
       <w:lvlText w:val="○"/>
@@ -3579,7 +3829,7 @@
         <w:ind w:left="3600" w:hanging="360"/>
       </w:pPr>
     </w:lvl>
-    <w:lvl w:ilvl="5" w:tplc="A10CBA74">
+    <w:lvl w:ilvl="5" w:tplc="18024E68">
       <w:start w:val="1"/>
       <w:numFmt w:val="bullet"/>
       <w:lvlText w:val="■"/>
@@ -3588,7 +3838,7 @@
         <w:ind w:left="4320" w:hanging="360"/>
       </w:pPr>
     </w:lvl>
-    <w:lvl w:ilvl="6" w:tplc="AD08A61E">
+    <w:lvl w:ilvl="6" w:tplc="4574E058">
       <w:start w:val="1"/>
       <w:numFmt w:val="bullet"/>
       <w:lvlText w:val="●"/>
@@ -3597,7 +3847,7 @@
         <w:ind w:left="5040" w:hanging="360"/>
       </w:pPr>
     </w:lvl>
-    <w:lvl w:ilvl="7" w:tplc="60D6727C">
+    <w:lvl w:ilvl="7" w:tplc="4F82B6E0">
       <w:start w:val="1"/>
       <w:numFmt w:val="bullet"/>
       <w:lvlText w:val="●"/>
@@ -3606,7 +3856,7 @@
         <w:ind w:left="5760" w:hanging="360"/>
       </w:pPr>
     </w:lvl>
-    <w:lvl w:ilvl="8" w:tplc="5BD0A70A">
+    <w:lvl w:ilvl="8" w:tplc="65BA2F1A">
       <w:start w:val="1"/>
       <w:numFmt w:val="bullet"/>
       <w:lvlText w:val="●"/>
@@ -3616,11 +3866,11 @@
       </w:pPr>
     </w:lvl>
   </w:abstractNum>
-  <w:abstractNum w:abstractNumId="1" w15:restartNumberingAfterBreak="0">
-    <w:nsid w:val="27CC6FF4"/>
+  <w:abstractNum w:abstractNumId="6" w15:restartNumberingAfterBreak="0">
+    <w:nsid w:val="6A7B3A2D"/>
     <w:multiLevelType w:val="hybridMultilevel"/>
-    <w:tmpl w:val="78AA8564"/>
-    <w:lvl w:ilvl="0" w:tplc="B526F9DA">
+    <w:tmpl w:val="0C7E8AA0"/>
+    <w:lvl w:ilvl="0" w:tplc="AF109C50">
       <w:start w:val="1"/>
       <w:numFmt w:val="decimal"/>
       <w:lvlText w:val="%1."/>
@@ -3629,349 +3879,79 @@
         <w:ind w:left="720" w:hanging="360"/>
       </w:pPr>
     </w:lvl>
-    <w:lvl w:ilvl="1" w:tplc="D7624764">
+    <w:lvl w:ilvl="1" w:tplc="1A941BFA">
       <w:numFmt w:val="decimal"/>
       <w:lvlText w:val=""/>
       <w:lvlJc w:val="left"/>
     </w:lvl>
-    <w:lvl w:ilvl="2" w:tplc="5F663076">
+    <w:lvl w:ilvl="2" w:tplc="8C840C80">
       <w:numFmt w:val="decimal"/>
       <w:lvlText w:val=""/>
       <w:lvlJc w:val="left"/>
     </w:lvl>
-    <w:lvl w:ilvl="3" w:tplc="A894AF96">
+    <w:lvl w:ilvl="3" w:tplc="EDC89BBC">
       <w:numFmt w:val="decimal"/>
       <w:lvlText w:val=""/>
       <w:lvlJc w:val="left"/>
     </w:lvl>
-    <w:lvl w:ilvl="4" w:tplc="7C2C3CDE">
+    <w:lvl w:ilvl="4" w:tplc="0AFCDEB4">
       <w:numFmt w:val="decimal"/>
       <w:lvlText w:val=""/>
       <w:lvlJc w:val="left"/>
     </w:lvl>
-    <w:lvl w:ilvl="5" w:tplc="7EF2B23C">
+    <w:lvl w:ilvl="5" w:tplc="5178D6C6">
       <w:numFmt w:val="decimal"/>
       <w:lvlText w:val=""/>
       <w:lvlJc w:val="left"/>
     </w:lvl>
-    <w:lvl w:ilvl="6" w:tplc="144C1460">
+    <w:lvl w:ilvl="6" w:tplc="28BAF18C">
       <w:numFmt w:val="decimal"/>
       <w:lvlText w:val=""/>
       <w:lvlJc w:val="left"/>
     </w:lvl>
-    <w:lvl w:ilvl="7" w:tplc="18A4B032">
+    <w:lvl w:ilvl="7" w:tplc="265E3EF4">
       <w:numFmt w:val="decimal"/>
       <w:lvlText w:val=""/>
       <w:lvlJc w:val="left"/>
     </w:lvl>
-    <w:lvl w:ilvl="8" w:tplc="0EEA846E">
+    <w:lvl w:ilvl="8" w:tplc="8350FCBC">
       <w:numFmt w:val="decimal"/>
       <w:lvlText w:val=""/>
       <w:lvlJc w:val="left"/>
     </w:lvl>
   </w:abstractNum>
-  <w:abstractNum w:abstractNumId="2" w15:restartNumberingAfterBreak="0">
-    <w:nsid w:val="3E5B61A3"/>
-    <w:multiLevelType w:val="hybridMultilevel"/>
-    <w:tmpl w:val="E64697DE"/>
-    <w:lvl w:ilvl="0" w:tplc="93B4FFA0">
-      <w:start w:val="1"/>
-      <w:numFmt w:val="bullet"/>
-      <w:lvlText w:val="•"/>
-      <w:lvlJc w:val="left"/>
-      <w:pPr>
-        <w:ind w:left="720" w:hanging="360"/>
-      </w:pPr>
-    </w:lvl>
-    <w:lvl w:ilvl="1" w:tplc="27FEA052">
-      <w:numFmt w:val="decimal"/>
-      <w:lvlText w:val=""/>
-      <w:lvlJc w:val="left"/>
-    </w:lvl>
-    <w:lvl w:ilvl="2" w:tplc="006440B6">
-      <w:numFmt w:val="decimal"/>
-      <w:lvlText w:val=""/>
-      <w:lvlJc w:val="left"/>
-    </w:lvl>
-    <w:lvl w:ilvl="3" w:tplc="EFCC017A">
-      <w:numFmt w:val="decimal"/>
-      <w:lvlText w:val=""/>
-      <w:lvlJc w:val="left"/>
-    </w:lvl>
-    <w:lvl w:ilvl="4" w:tplc="26060972">
-      <w:numFmt w:val="decimal"/>
-      <w:lvlText w:val=""/>
-      <w:lvlJc w:val="left"/>
-    </w:lvl>
-    <w:lvl w:ilvl="5" w:tplc="C108F4F0">
-      <w:numFmt w:val="decimal"/>
-      <w:lvlText w:val=""/>
-      <w:lvlJc w:val="left"/>
-    </w:lvl>
-    <w:lvl w:ilvl="6" w:tplc="1DEE767E">
-      <w:numFmt w:val="decimal"/>
-      <w:lvlText w:val=""/>
-      <w:lvlJc w:val="left"/>
-    </w:lvl>
-    <w:lvl w:ilvl="7" w:tplc="63D8BAE2">
-      <w:numFmt w:val="decimal"/>
-      <w:lvlText w:val=""/>
-      <w:lvlJc w:val="left"/>
-    </w:lvl>
-    <w:lvl w:ilvl="8" w:tplc="F7C62ECE">
-      <w:numFmt w:val="decimal"/>
-      <w:lvlText w:val=""/>
-      <w:lvlJc w:val="left"/>
-    </w:lvl>
-  </w:abstractNum>
-  <w:abstractNum w:abstractNumId="3" w15:restartNumberingAfterBreak="0">
-    <w:nsid w:val="561649AC"/>
-    <w:multiLevelType w:val="hybridMultilevel"/>
-    <w:tmpl w:val="3F10A674"/>
-    <w:lvl w:ilvl="0" w:tplc="3118C560">
-      <w:start w:val="1"/>
-      <w:numFmt w:val="decimal"/>
-      <w:lvlText w:val="%1."/>
-      <w:lvlJc w:val="left"/>
-      <w:pPr>
-        <w:ind w:left="720" w:hanging="360"/>
-      </w:pPr>
-    </w:lvl>
-    <w:lvl w:ilvl="1" w:tplc="70503684">
-      <w:numFmt w:val="decimal"/>
-      <w:lvlText w:val=""/>
-      <w:lvlJc w:val="left"/>
-    </w:lvl>
-    <w:lvl w:ilvl="2" w:tplc="B70E02AE">
-      <w:numFmt w:val="decimal"/>
-      <w:lvlText w:val=""/>
-      <w:lvlJc w:val="left"/>
-    </w:lvl>
-    <w:lvl w:ilvl="3" w:tplc="40DA5590">
-      <w:numFmt w:val="decimal"/>
-      <w:lvlText w:val=""/>
-      <w:lvlJc w:val="left"/>
-    </w:lvl>
-    <w:lvl w:ilvl="4" w:tplc="F9CE18AC">
-      <w:numFmt w:val="decimal"/>
-      <w:lvlText w:val=""/>
-      <w:lvlJc w:val="left"/>
-    </w:lvl>
-    <w:lvl w:ilvl="5" w:tplc="073E327E">
-      <w:numFmt w:val="decimal"/>
-      <w:lvlText w:val=""/>
-      <w:lvlJc w:val="left"/>
-    </w:lvl>
-    <w:lvl w:ilvl="6" w:tplc="78305AC6">
-      <w:numFmt w:val="decimal"/>
-      <w:lvlText w:val=""/>
-      <w:lvlJc w:val="left"/>
-    </w:lvl>
-    <w:lvl w:ilvl="7" w:tplc="EF648C64">
-      <w:numFmt w:val="decimal"/>
-      <w:lvlText w:val=""/>
-      <w:lvlJc w:val="left"/>
-    </w:lvl>
-    <w:lvl w:ilvl="8" w:tplc="713456AA">
-      <w:numFmt w:val="decimal"/>
-      <w:lvlText w:val=""/>
-      <w:lvlJc w:val="left"/>
-    </w:lvl>
-  </w:abstractNum>
-  <w:abstractNum w:abstractNumId="4" w15:restartNumberingAfterBreak="0">
-    <w:nsid w:val="5C0C0665"/>
-    <w:multiLevelType w:val="hybridMultilevel"/>
-    <w:tmpl w:val="2236FD52"/>
-    <w:lvl w:ilvl="0" w:tplc="DF2C5EBA">
-      <w:start w:val="1"/>
-      <w:numFmt w:val="decimal"/>
-      <w:lvlText w:val="%1."/>
-      <w:lvlJc w:val="left"/>
-      <w:pPr>
-        <w:ind w:left="720" w:hanging="360"/>
-      </w:pPr>
-    </w:lvl>
-    <w:lvl w:ilvl="1" w:tplc="6A4C438A">
-      <w:numFmt w:val="decimal"/>
-      <w:lvlText w:val=""/>
-      <w:lvlJc w:val="left"/>
-    </w:lvl>
-    <w:lvl w:ilvl="2" w:tplc="72FEDF1E">
-      <w:numFmt w:val="decimal"/>
-      <w:lvlText w:val=""/>
-      <w:lvlJc w:val="left"/>
-    </w:lvl>
-    <w:lvl w:ilvl="3" w:tplc="35427156">
-      <w:numFmt w:val="decimal"/>
-      <w:lvlText w:val=""/>
-      <w:lvlJc w:val="left"/>
-    </w:lvl>
-    <w:lvl w:ilvl="4" w:tplc="4B209AD8">
-      <w:numFmt w:val="decimal"/>
-      <w:lvlText w:val=""/>
-      <w:lvlJc w:val="left"/>
-    </w:lvl>
-    <w:lvl w:ilvl="5" w:tplc="D15658CE">
-      <w:numFmt w:val="decimal"/>
-      <w:lvlText w:val=""/>
-      <w:lvlJc w:val="left"/>
-    </w:lvl>
-    <w:lvl w:ilvl="6" w:tplc="61E88988">
-      <w:numFmt w:val="decimal"/>
-      <w:lvlText w:val=""/>
-      <w:lvlJc w:val="left"/>
-    </w:lvl>
-    <w:lvl w:ilvl="7" w:tplc="9356F660">
-      <w:numFmt w:val="decimal"/>
-      <w:lvlText w:val=""/>
-      <w:lvlJc w:val="left"/>
-    </w:lvl>
-    <w:lvl w:ilvl="8" w:tplc="6DB096FE">
-      <w:numFmt w:val="decimal"/>
-      <w:lvlText w:val=""/>
-      <w:lvlJc w:val="left"/>
-    </w:lvl>
-  </w:abstractNum>
-  <w:abstractNum w:abstractNumId="5" w15:restartNumberingAfterBreak="0">
-    <w:nsid w:val="631030FB"/>
-    <w:multiLevelType w:val="hybridMultilevel"/>
-    <w:tmpl w:val="948ADE2A"/>
-    <w:lvl w:ilvl="0" w:tplc="7818BD32">
-      <w:start w:val="1"/>
-      <w:numFmt w:val="decimal"/>
-      <w:lvlText w:val="%1."/>
-      <w:lvlJc w:val="left"/>
-      <w:pPr>
-        <w:ind w:left="720" w:hanging="360"/>
-      </w:pPr>
-    </w:lvl>
-    <w:lvl w:ilvl="1" w:tplc="BBF66C36">
-      <w:numFmt w:val="decimal"/>
-      <w:lvlText w:val=""/>
-      <w:lvlJc w:val="left"/>
-    </w:lvl>
-    <w:lvl w:ilvl="2" w:tplc="B56EE8A6">
-      <w:numFmt w:val="decimal"/>
-      <w:lvlText w:val=""/>
-      <w:lvlJc w:val="left"/>
-    </w:lvl>
-    <w:lvl w:ilvl="3" w:tplc="F012828C">
-      <w:numFmt w:val="decimal"/>
-      <w:lvlText w:val=""/>
-      <w:lvlJc w:val="left"/>
-    </w:lvl>
-    <w:lvl w:ilvl="4" w:tplc="9E9C6502">
-      <w:numFmt w:val="decimal"/>
-      <w:lvlText w:val=""/>
-      <w:lvlJc w:val="left"/>
-    </w:lvl>
-    <w:lvl w:ilvl="5" w:tplc="6A860876">
-      <w:numFmt w:val="decimal"/>
-      <w:lvlText w:val=""/>
-      <w:lvlJc w:val="left"/>
-    </w:lvl>
-    <w:lvl w:ilvl="6" w:tplc="E60E53BA">
-      <w:numFmt w:val="decimal"/>
-      <w:lvlText w:val=""/>
-      <w:lvlJc w:val="left"/>
-    </w:lvl>
-    <w:lvl w:ilvl="7" w:tplc="9E801824">
-      <w:numFmt w:val="decimal"/>
-      <w:lvlText w:val=""/>
-      <w:lvlJc w:val="left"/>
-    </w:lvl>
-    <w:lvl w:ilvl="8" w:tplc="9C74978C">
-      <w:numFmt w:val="decimal"/>
-      <w:lvlText w:val=""/>
-      <w:lvlJc w:val="left"/>
-    </w:lvl>
-  </w:abstractNum>
-  <w:abstractNum w:abstractNumId="6" w15:restartNumberingAfterBreak="0">
-    <w:nsid w:val="79D35D9B"/>
-    <w:multiLevelType w:val="hybridMultilevel"/>
-    <w:tmpl w:val="8228AA1C"/>
-    <w:lvl w:ilvl="0" w:tplc="6DAA933A">
-      <w:start w:val="1"/>
-      <w:numFmt w:val="decimal"/>
-      <w:lvlText w:val="%1."/>
-      <w:lvlJc w:val="left"/>
-      <w:pPr>
-        <w:ind w:left="720" w:hanging="360"/>
-      </w:pPr>
-    </w:lvl>
-    <w:lvl w:ilvl="1" w:tplc="C192789A">
-      <w:numFmt w:val="decimal"/>
-      <w:lvlText w:val=""/>
-      <w:lvlJc w:val="left"/>
-    </w:lvl>
-    <w:lvl w:ilvl="2" w:tplc="39F4D126">
-      <w:numFmt w:val="decimal"/>
-      <w:lvlText w:val=""/>
-      <w:lvlJc w:val="left"/>
-    </w:lvl>
-    <w:lvl w:ilvl="3" w:tplc="380A54D8">
-      <w:numFmt w:val="decimal"/>
-      <w:lvlText w:val=""/>
-      <w:lvlJc w:val="left"/>
-    </w:lvl>
-    <w:lvl w:ilvl="4" w:tplc="6D9EA7DC">
-      <w:numFmt w:val="decimal"/>
-      <w:lvlText w:val=""/>
-      <w:lvlJc w:val="left"/>
-    </w:lvl>
-    <w:lvl w:ilvl="5" w:tplc="48729698">
-      <w:numFmt w:val="decimal"/>
-      <w:lvlText w:val=""/>
-      <w:lvlJc w:val="left"/>
-    </w:lvl>
-    <w:lvl w:ilvl="6" w:tplc="E8E68008">
-      <w:numFmt w:val="decimal"/>
-      <w:lvlText w:val=""/>
-      <w:lvlJc w:val="left"/>
-    </w:lvl>
-    <w:lvl w:ilvl="7" w:tplc="4446A938">
-      <w:numFmt w:val="decimal"/>
-      <w:lvlText w:val=""/>
-      <w:lvlJc w:val="left"/>
-    </w:lvl>
-    <w:lvl w:ilvl="8" w:tplc="50986CBA">
-      <w:numFmt w:val="decimal"/>
-      <w:lvlText w:val=""/>
-      <w:lvlJc w:val="left"/>
-    </w:lvl>
-  </w:abstractNum>
-  <w:num w:numId="1" w16cid:durableId="611012430">
+  <w:num w:numId="1" w16cid:durableId="1256475115">
+    <w:abstractNumId w:val="5"/>
+    <w:lvlOverride w:ilvl="0">
+      <w:startOverride w:val="1"/>
+    </w:lvlOverride>
+  </w:num>
+  <w:num w:numId="2" w16cid:durableId="983662364">
+    <w:abstractNumId w:val="4"/>
+    <w:lvlOverride w:ilvl="0">
+      <w:startOverride w:val="1"/>
+    </w:lvlOverride>
+  </w:num>
+  <w:num w:numId="3" w16cid:durableId="772019006">
     <w:abstractNumId w:val="0"/>
     <w:lvlOverride w:ilvl="0">
       <w:startOverride w:val="1"/>
     </w:lvlOverride>
   </w:num>
-  <w:num w:numId="2" w16cid:durableId="38213288">
+  <w:num w:numId="4" w16cid:durableId="2109151863">
     <w:abstractNumId w:val="3"/>
     <w:lvlOverride w:ilvl="0">
       <w:startOverride w:val="1"/>
     </w:lvlOverride>
   </w:num>
-  <w:num w:numId="3" w16cid:durableId="745881334">
-    <w:abstractNumId w:val="2"/>
-    <w:lvlOverride w:ilvl="0">
-      <w:startOverride w:val="1"/>
-    </w:lvlOverride>
-  </w:num>
-  <w:num w:numId="4" w16cid:durableId="1511604360">
-    <w:abstractNumId w:val="5"/>
-    <w:lvlOverride w:ilvl="0">
-      <w:startOverride w:val="1"/>
-    </w:lvlOverride>
-  </w:num>
-  <w:num w:numId="5" w16cid:durableId="508370700">
+  <w:num w:numId="5" w16cid:durableId="1984889797">
     <w:abstractNumId w:val="6"/>
     <w:lvlOverride w:ilvl="0">
       <w:startOverride w:val="1"/>
     </w:lvlOverride>
   </w:num>
-  <w:num w:numId="6" w16cid:durableId="130560511">
-    <w:abstractNumId w:val="4"/>
+  <w:num w:numId="6" w16cid:durableId="847646442">
+    <w:abstractNumId w:val="1"/>
     <w:lvlOverride w:ilvl="0">
       <w:startOverride w:val="1"/>
     </w:lvlOverride>
@@ -4589,7 +4569,7 @@
     <w:autoRedefine/>
     <w:uiPriority w:val="39"/>
     <w:unhideWhenUsed/>
-    <w:rsid w:val="007169E7"/>
+    <w:rsid w:val="00D82CD2"/>
     <w:pPr>
       <w:spacing w:after="100"/>
     </w:pPr>
@@ -4601,7 +4581,7 @@
     <w:autoRedefine/>
     <w:uiPriority w:val="39"/>
     <w:unhideWhenUsed/>
-    <w:rsid w:val="007169E7"/>
+    <w:rsid w:val="00D82CD2"/>
     <w:pPr>
       <w:spacing w:after="100"/>
       <w:ind w:left="220"/>

</xml_diff>